<commit_message>
docs: dört modelin otomatik puanları, ölçüt kör noktası ve düzeltme kaydı
Dört model yeni otomatik puanlamayla yeniden koşuldu. Kritik bulgu: qwen3-1.7b
otomatik puanda qwen2.5-1.5b ile aynı sonucu (20/28) aldı, oysa cevapları
kullanılamaz durumda — İngilizce muhakeme metni doğru komutu içerdiği için puan
alıyor. Ölçüt doğru bilginin bulunduğunu ölçüyor, cevabın kullanılabilir
olduğunu değil; rapor, sunum ve README bunu açıkça yazıyor.

Değerlendirme raporuna Bölüm 8 (bulunan üç sessiz hata ve düzeltmeleri) eklendi,
sunuma aynı konuda slayt geldi, Word raporu yeni tabloyla yeniden üretildi.

Co-Authored-By: Claude Opus 5 <noreply@anthropic.com>
Claude-Session: https://claude.ai/code/session_01SJvJCPoSUxKzcQB6yPy2t2
</commit_message>
<xml_diff>
--- a/docs/rapor/personas-proje-raporu.docx
+++ b/docs/rapor/personas-proje-raporu.docx
@@ -749,7 +749,7 @@
                 <w:sz w:val="20"/>
                 <w:szCs w:val="20"/>
               </w:rPr>
-              <w:t xml:space="preserve">Kısmen: seçilen modelde p50 3,95 sn; hafif alternatif qwen2.5-1.5b ile 2,45 sn (Bölüm 6.4)</w:t>
+              <w:t xml:space="preserve">Kısmen: seçilen modelde p50 ~4,7 sn; hafif alternatif qwen2.5-1.5b ile ~3,0 sn (Bölüm 6.4)</w:t>
             </w:r>
           </w:p>
         </w:tc>
@@ -888,7 +888,40 @@
         <w:spacing w:after="120" w:before="240"/>
       </w:pPr>
       <w:r>
-        <w:t xml:space="preserve">3.3 Yazma işlemleri ve onay kapısı</w:t>
+        <w:t xml:space="preserve">3.3 Cevap akışı ve çok turlu konuşma</w:t>
+      </w:r>
+    </w:p>
+    <w:p>
+      <w:pPr>
+        <w:spacing w:after="120" w:line="276"/>
+      </w:pPr>
+      <w:r>
+        <w:rPr>
+          <w:sz w:val="22"/>
+          <w:szCs w:val="22"/>
+        </w:rPr>
+        <w:t xml:space="preserve">Cevap, modelden geldikçe parça parça arayüze yazılır (assistant.answer_stream). Ölçülen süre değişmez ama kullanıcı ilk kelimeleri saniyenin altında görür; küçük modelde p95 gecikmenin on saniyeyi aşabildiği düşünülürse bu belirgin bir fark yaratır. Model çağrılmayan akışlarda (yazma taslağı, bilgi bulunamaması, uygulama açma) tek seferde sonuç döner.</w:t>
+      </w:r>
+    </w:p>
+    <w:p>
+      <w:pPr>
+        <w:spacing w:after="120" w:line="276"/>
+      </w:pPr>
+      <w:r>
+        <w:rPr>
+          <w:sz w:val="22"/>
+          <w:szCs w:val="22"/>
+        </w:rPr>
+        <w:t xml:space="preserve">Asistan son iki turu hatırlar: geçmiş isteme eklenir ve işaret zamiri içeren takip soruları erişim için önceki soruyla genişletilir. Genişletme uzunluğa değil zamire bakar; böylece kendi başına anlamlı kısa sorular ("RAG nedir?") bozulmaz. Örnek: "Python'da sanal ortam nasıl oluşturulur?" sorusunun ardından "Peki onu nasıl kapatırım?" sorusu doğru biçimde deactivate cevabını verir.</w:t>
+      </w:r>
+    </w:p>
+    <w:p>
+      <w:pPr>
+        <w:pStyle w:val="Heading2"/>
+        <w:spacing w:after="120" w:before="240"/>
+      </w:pPr>
+      <w:r>
+        <w:t xml:space="preserve">3.4 Yazma işlemleri ve onay kapısı</w:t>
       </w:r>
     </w:p>
     <w:p>
@@ -1653,7 +1686,7 @@
           <w:sz w:val="22"/>
           <w:szCs w:val="22"/>
         </w:rPr>
-        <w:t xml:space="preserve">Ölçümler 30 soruluk sabit bir set (eval/questions.json) üzerinde, scripts/evaluate.py ile yapılmıştır. Ham koşum çıktıları docs/eval/ klasöründedir. Ayrıntılı analiz için docs/eval/degerlendirme-raporu.md dosyasına bakılabilir.</w:t>
+        <w:t xml:space="preserve">Ölçümler 30 soruluk sabit bir set (eval/questions.json) üzerinde, scripts/evaluate.py ile yapılmıştır. Gecikmeler koşumdan koşuma değiştiği için (aynı model iki koşumda p50 3,95 ve 4,72 saniye vermiştir) tek bir ondalık basamağa anlam yüklenmemelidir; modeller arası fark bu oynaklıktan büyüktür. Ham koşum çıktıları docs/eval/ klasöründedir. Ayrıntılı analiz için docs/eval/degerlendirme-raporu.md dosyasına bakılabilir.</w:t>
       </w:r>
     </w:p>
     <w:p>
@@ -2858,12 +2891,13 @@
         </w:tblBorders>
       </w:tblPr>
       <w:tblGrid>
-        <w:gridCol w:w="1900"/>
+        <w:gridCol w:w="1740"/>
         <w:gridCol w:w="900"/>
-        <w:gridCol w:w="900"/>
+        <w:gridCol w:w="1180"/>
+        <w:gridCol w:w="1220"/>
         <w:gridCol w:w="900"/>
         <w:gridCol w:w="1200"/>
-        <w:gridCol w:w="3560"/>
+        <w:gridCol w:w="2220"/>
       </w:tblGrid>
       <w:tr>
         <w:trPr>
@@ -2871,7 +2905,7 @@
         </w:trPr>
         <w:tc>
           <w:tcPr>
-            <w:tcW w:type="dxa" w:w="1900"/>
+            <w:tcW w:type="dxa" w:w="1740"/>
             <w:shd w:fill="EFE8D6" w:color="auto" w:val="clear"/>
             <w:tcMar>
               <w:top w:type="dxa" w:w="60"/>
@@ -2923,6 +2957,58 @@
         </w:tc>
         <w:tc>
           <w:tcPr>
+            <w:tcW w:type="dxa" w:w="1180"/>
+            <w:shd w:fill="EFE8D6" w:color="auto" w:val="clear"/>
+            <w:tcMar>
+              <w:top w:type="dxa" w:w="60"/>
+              <w:left w:type="dxa" w:w="100"/>
+              <w:bottom w:type="dxa" w:w="60"/>
+              <w:right w:type="dxa" w:w="100"/>
+            </w:tcMar>
+          </w:tcPr>
+          <w:p>
+            <w:pPr>
+              <w:spacing w:after="0" w:line="240"/>
+            </w:pPr>
+            <w:r>
+              <w:rPr>
+                <w:b/>
+                <w:bCs/>
+                <w:sz w:val="20"/>
+                <w:szCs w:val="20"/>
+              </w:rPr>
+              <w:t xml:space="preserve">Oto kalite</w:t>
+            </w:r>
+          </w:p>
+        </w:tc>
+        <w:tc>
+          <w:tcPr>
+            <w:tcW w:type="dxa" w:w="1220"/>
+            <w:shd w:fill="EFE8D6" w:color="auto" w:val="clear"/>
+            <w:tcMar>
+              <w:top w:type="dxa" w:w="60"/>
+              <w:left w:type="dxa" w:w="100"/>
+              <w:bottom w:type="dxa" w:w="60"/>
+              <w:right w:type="dxa" w:w="100"/>
+            </w:tcMar>
+          </w:tcPr>
+          <w:p>
+            <w:pPr>
+              <w:spacing w:after="0" w:line="240"/>
+            </w:pPr>
+            <w:r>
+              <w:rPr>
+                <w:b/>
+                <w:bCs/>
+                <w:sz w:val="20"/>
+                <w:szCs w:val="20"/>
+              </w:rPr>
+              <w:t xml:space="preserve">Elle kalite</w:t>
+            </w:r>
+          </w:p>
+        </w:tc>
+        <w:tc>
+          <w:tcPr>
             <w:tcW w:type="dxa" w:w="900"/>
             <w:shd w:fill="EFE8D6" w:color="auto" w:val="clear"/>
             <w:tcMar>
@@ -2949,7 +3035,7 @@
         </w:tc>
         <w:tc>
           <w:tcPr>
-            <w:tcW w:type="dxa" w:w="900"/>
+            <w:tcW w:type="dxa" w:w="1200"/>
             <w:shd w:fill="EFE8D6" w:color="auto" w:val="clear"/>
             <w:tcMar>
               <w:top w:type="dxa" w:w="60"/>
@@ -2969,13 +3055,13 @@
                 <w:sz w:val="20"/>
                 <w:szCs w:val="20"/>
               </w:rPr>
-              <w:t xml:space="preserve">p95</w:t>
-            </w:r>
-          </w:p>
-        </w:tc>
-        <w:tc>
-          <w:tcPr>
-            <w:tcW w:type="dxa" w:w="1200"/>
+              <w:t xml:space="preserve">Çekimserlik</w:t>
+            </w:r>
+          </w:p>
+        </w:tc>
+        <w:tc>
+          <w:tcPr>
+            <w:tcW w:type="dxa" w:w="2220"/>
             <w:shd w:fill="EFE8D6" w:color="auto" w:val="clear"/>
             <w:tcMar>
               <w:top w:type="dxa" w:w="60"/>
@@ -2995,33 +3081,7 @@
                 <w:sz w:val="20"/>
                 <w:szCs w:val="20"/>
               </w:rPr>
-              <w:t xml:space="preserve">Çekimserlik</w:t>
-            </w:r>
-          </w:p>
-        </w:tc>
-        <w:tc>
-          <w:tcPr>
-            <w:tcW w:type="dxa" w:w="3560"/>
-            <w:shd w:fill="EFE8D6" w:color="auto" w:val="clear"/>
-            <w:tcMar>
-              <w:top w:type="dxa" w:w="60"/>
-              <w:left w:type="dxa" w:w="100"/>
-              <w:bottom w:type="dxa" w:w="60"/>
-              <w:right w:type="dxa" w:w="100"/>
-            </w:tcMar>
-          </w:tcPr>
-          <w:p>
-            <w:pPr>
-              <w:spacing w:after="0" w:line="240"/>
-            </w:pPr>
-            <w:r>
-              <w:rPr>
-                <w:b/>
-                <w:bCs/>
-                <w:sz w:val="20"/>
-                <w:szCs w:val="20"/>
-              </w:rPr>
-              <w:t xml:space="preserve">Değerlendirme</w:t>
+              <w:t xml:space="preserve">Sonuç</w:t>
             </w:r>
           </w:p>
         </w:tc>
@@ -3029,7 +3089,7 @@
       <w:tr>
         <w:tc>
           <w:tcPr>
-            <w:tcW w:type="dxa" w:w="1900"/>
+            <w:tcW w:type="dxa" w:w="1740"/>
             <w:tcMar>
               <w:top w:type="dxa" w:w="60"/>
               <w:left w:type="dxa" w:w="100"/>
@@ -3075,6 +3135,52 @@
         </w:tc>
         <w:tc>
           <w:tcPr>
+            <w:tcW w:type="dxa" w:w="1180"/>
+            <w:tcMar>
+              <w:top w:type="dxa" w:w="60"/>
+              <w:left w:type="dxa" w:w="100"/>
+              <w:bottom w:type="dxa" w:w="60"/>
+              <w:right w:type="dxa" w:w="100"/>
+            </w:tcMar>
+          </w:tcPr>
+          <w:p>
+            <w:pPr>
+              <w:spacing w:after="0" w:line="240"/>
+            </w:pPr>
+            <w:r>
+              <w:rPr>
+                <w:sz w:val="20"/>
+                <w:szCs w:val="20"/>
+              </w:rPr>
+              <w:t xml:space="preserve">24/28</w:t>
+            </w:r>
+          </w:p>
+        </w:tc>
+        <w:tc>
+          <w:tcPr>
+            <w:tcW w:type="dxa" w:w="1220"/>
+            <w:tcMar>
+              <w:top w:type="dxa" w:w="60"/>
+              <w:left w:type="dxa" w:w="100"/>
+              <w:bottom w:type="dxa" w:w="60"/>
+              <w:right w:type="dxa" w:w="100"/>
+            </w:tcMar>
+          </w:tcPr>
+          <w:p>
+            <w:pPr>
+              <w:spacing w:after="0" w:line="240"/>
+            </w:pPr>
+            <w:r>
+              <w:rPr>
+                <w:sz w:val="20"/>
+                <w:szCs w:val="20"/>
+              </w:rPr>
+              <w:t xml:space="preserve">22/28</w:t>
+            </w:r>
+          </w:p>
+        </w:tc>
+        <w:tc>
+          <w:tcPr>
             <w:tcW w:type="dxa" w:w="900"/>
             <w:tcMar>
               <w:top w:type="dxa" w:w="60"/>
@@ -3092,30 +3198,7 @@
                 <w:sz w:val="20"/>
                 <w:szCs w:val="20"/>
               </w:rPr>
-              <w:t xml:space="preserve">3,95 sn</w:t>
-            </w:r>
-          </w:p>
-        </w:tc>
-        <w:tc>
-          <w:tcPr>
-            <w:tcW w:type="dxa" w:w="900"/>
-            <w:tcMar>
-              <w:top w:type="dxa" w:w="60"/>
-              <w:left w:type="dxa" w:w="100"/>
-              <w:bottom w:type="dxa" w:w="60"/>
-              <w:right w:type="dxa" w:w="100"/>
-            </w:tcMar>
-          </w:tcPr>
-          <w:p>
-            <w:pPr>
-              <w:spacing w:after="0" w:line="240"/>
-            </w:pPr>
-            <w:r>
-              <w:rPr>
-                <w:sz w:val="20"/>
-                <w:szCs w:val="20"/>
-              </w:rPr>
-              <w:t xml:space="preserve">10,92 sn</w:t>
+              <w:t xml:space="preserve">4,72 sn</w:t>
             </w:r>
           </w:p>
         </w:tc>
@@ -3144,24 +3227,24 @@
         </w:tc>
         <w:tc>
           <w:tcPr>
-            <w:tcW w:type="dxa" w:w="3560"/>
-            <w:tcMar>
-              <w:top w:type="dxa" w:w="60"/>
-              <w:left w:type="dxa" w:w="100"/>
-              <w:bottom w:type="dxa" w:w="60"/>
-              <w:right w:type="dxa" w:w="100"/>
-            </w:tcMar>
-          </w:tcPr>
-          <w:p>
-            <w:pPr>
-              <w:spacing w:after="0" w:line="240"/>
-            </w:pPr>
-            <w:r>
-              <w:rPr>
-                <w:sz w:val="20"/>
-                <w:szCs w:val="20"/>
-              </w:rPr>
-              <w:t xml:space="preserve">Seçilen. Kalite 22/28; tehlikeli git sorusunu doğru cevaplayan tek model</w:t>
+            <w:tcW w:type="dxa" w:w="2220"/>
+            <w:tcMar>
+              <w:top w:type="dxa" w:w="60"/>
+              <w:left w:type="dxa" w:w="100"/>
+              <w:bottom w:type="dxa" w:w="60"/>
+              <w:right w:type="dxa" w:w="100"/>
+            </w:tcMar>
+          </w:tcPr>
+          <w:p>
+            <w:pPr>
+              <w:spacing w:after="0" w:line="240"/>
+            </w:pPr>
+            <w:r>
+              <w:rPr>
+                <w:sz w:val="20"/>
+                <w:szCs w:val="20"/>
+              </w:rPr>
+              <w:t xml:space="preserve">Seçilen</w:t>
             </w:r>
           </w:p>
         </w:tc>
@@ -3169,7 +3252,7 @@
       <w:tr>
         <w:tc>
           <w:tcPr>
-            <w:tcW w:type="dxa" w:w="1900"/>
+            <w:tcW w:type="dxa" w:w="1740"/>
             <w:shd w:fill="F7F7F7" w:color="auto" w:val="clear"/>
             <w:tcMar>
               <w:top w:type="dxa" w:w="60"/>
@@ -3217,6 +3300,54 @@
         </w:tc>
         <w:tc>
           <w:tcPr>
+            <w:tcW w:type="dxa" w:w="1180"/>
+            <w:shd w:fill="F7F7F7" w:color="auto" w:val="clear"/>
+            <w:tcMar>
+              <w:top w:type="dxa" w:w="60"/>
+              <w:left w:type="dxa" w:w="100"/>
+              <w:bottom w:type="dxa" w:w="60"/>
+              <w:right w:type="dxa" w:w="100"/>
+            </w:tcMar>
+          </w:tcPr>
+          <w:p>
+            <w:pPr>
+              <w:spacing w:after="0" w:line="240"/>
+            </w:pPr>
+            <w:r>
+              <w:rPr>
+                <w:sz w:val="20"/>
+                <w:szCs w:val="20"/>
+              </w:rPr>
+              <w:t xml:space="preserve">20/28</w:t>
+            </w:r>
+          </w:p>
+        </w:tc>
+        <w:tc>
+          <w:tcPr>
+            <w:tcW w:type="dxa" w:w="1220"/>
+            <w:shd w:fill="F7F7F7" w:color="auto" w:val="clear"/>
+            <w:tcMar>
+              <w:top w:type="dxa" w:w="60"/>
+              <w:left w:type="dxa" w:w="100"/>
+              <w:bottom w:type="dxa" w:w="60"/>
+              <w:right w:type="dxa" w:w="100"/>
+            </w:tcMar>
+          </w:tcPr>
+          <w:p>
+            <w:pPr>
+              <w:spacing w:after="0" w:line="240"/>
+            </w:pPr>
+            <w:r>
+              <w:rPr>
+                <w:sz w:val="20"/>
+                <w:szCs w:val="20"/>
+              </w:rPr>
+              <w:t xml:space="preserve">18/28</w:t>
+            </w:r>
+          </w:p>
+        </w:tc>
+        <w:tc>
+          <w:tcPr>
             <w:tcW w:type="dxa" w:w="900"/>
             <w:shd w:fill="F7F7F7" w:color="auto" w:val="clear"/>
             <w:tcMar>
@@ -3235,31 +3366,7 @@
                 <w:sz w:val="20"/>
                 <w:szCs w:val="20"/>
               </w:rPr>
-              <w:t xml:space="preserve">2,45 sn</w:t>
-            </w:r>
-          </w:p>
-        </w:tc>
-        <w:tc>
-          <w:tcPr>
-            <w:tcW w:type="dxa" w:w="900"/>
-            <w:shd w:fill="F7F7F7" w:color="auto" w:val="clear"/>
-            <w:tcMar>
-              <w:top w:type="dxa" w:w="60"/>
-              <w:left w:type="dxa" w:w="100"/>
-              <w:bottom w:type="dxa" w:w="60"/>
-              <w:right w:type="dxa" w:w="100"/>
-            </w:tcMar>
-          </w:tcPr>
-          <w:p>
-            <w:pPr>
-              <w:spacing w:after="0" w:line="240"/>
-            </w:pPr>
-            <w:r>
-              <w:rPr>
-                <w:sz w:val="20"/>
-                <w:szCs w:val="20"/>
-              </w:rPr>
-              <w:t xml:space="preserve">5,68 sn</w:t>
+              <w:t xml:space="preserve">2,98 sn</w:t>
             </w:r>
           </w:p>
         </w:tc>
@@ -3289,25 +3396,25 @@
         </w:tc>
         <w:tc>
           <w:tcPr>
-            <w:tcW w:type="dxa" w:w="3560"/>
-            <w:shd w:fill="F7F7F7" w:color="auto" w:val="clear"/>
-            <w:tcMar>
-              <w:top w:type="dxa" w:w="60"/>
-              <w:left w:type="dxa" w:w="100"/>
-              <w:bottom w:type="dxa" w:w="60"/>
-              <w:right w:type="dxa" w:w="100"/>
-            </w:tcMar>
-          </w:tcPr>
-          <w:p>
-            <w:pPr>
-              <w:spacing w:after="0" w:line="240"/>
-            </w:pPr>
-            <w:r>
-              <w:rPr>
-                <w:sz w:val="20"/>
-                <w:szCs w:val="20"/>
-              </w:rPr>
-              <w:t xml:space="preserve">Kalite 18/28. En hızlısı; hafif donanım için önerilen alternatif</w:t>
+            <w:tcW w:type="dxa" w:w="2220"/>
+            <w:shd w:fill="F7F7F7" w:color="auto" w:val="clear"/>
+            <w:tcMar>
+              <w:top w:type="dxa" w:w="60"/>
+              <w:left w:type="dxa" w:w="100"/>
+              <w:bottom w:type="dxa" w:w="60"/>
+              <w:right w:type="dxa" w:w="100"/>
+            </w:tcMar>
+          </w:tcPr>
+          <w:p>
+            <w:pPr>
+              <w:spacing w:after="0" w:line="240"/>
+            </w:pPr>
+            <w:r>
+              <w:rPr>
+                <w:sz w:val="20"/>
+                <w:szCs w:val="20"/>
+              </w:rPr>
+              <w:t xml:space="preserve">Hafif alternatif</w:t>
             </w:r>
           </w:p>
         </w:tc>
@@ -3315,7 +3422,7 @@
       <w:tr>
         <w:tc>
           <w:tcPr>
-            <w:tcW w:type="dxa" w:w="1900"/>
+            <w:tcW w:type="dxa" w:w="1740"/>
             <w:tcMar>
               <w:top w:type="dxa" w:w="60"/>
               <w:left w:type="dxa" w:w="100"/>
@@ -3361,6 +3468,52 @@
         </w:tc>
         <w:tc>
           <w:tcPr>
+            <w:tcW w:type="dxa" w:w="1180"/>
+            <w:tcMar>
+              <w:top w:type="dxa" w:w="60"/>
+              <w:left w:type="dxa" w:w="100"/>
+              <w:bottom w:type="dxa" w:w="60"/>
+              <w:right w:type="dxa" w:w="100"/>
+            </w:tcMar>
+          </w:tcPr>
+          <w:p>
+            <w:pPr>
+              <w:spacing w:after="0" w:line="240"/>
+            </w:pPr>
+            <w:r>
+              <w:rPr>
+                <w:sz w:val="20"/>
+                <w:szCs w:val="20"/>
+              </w:rPr>
+              <w:t xml:space="preserve">14/28</w:t>
+            </w:r>
+          </w:p>
+        </w:tc>
+        <w:tc>
+          <w:tcPr>
+            <w:tcW w:type="dxa" w:w="1220"/>
+            <w:tcMar>
+              <w:top w:type="dxa" w:w="60"/>
+              <w:left w:type="dxa" w:w="100"/>
+              <w:bottom w:type="dxa" w:w="60"/>
+              <w:right w:type="dxa" w:w="100"/>
+            </w:tcMar>
+          </w:tcPr>
+          <w:p>
+            <w:pPr>
+              <w:spacing w:after="0" w:line="240"/>
+            </w:pPr>
+            <w:r>
+              <w:rPr>
+                <w:sz w:val="20"/>
+                <w:szCs w:val="20"/>
+              </w:rPr>
+              <w:t xml:space="preserve">11/28</w:t>
+            </w:r>
+          </w:p>
+        </w:tc>
+        <w:tc>
+          <w:tcPr>
             <w:tcW w:type="dxa" w:w="900"/>
             <w:tcMar>
               <w:top w:type="dxa" w:w="60"/>
@@ -3378,30 +3531,7 @@
                 <w:sz w:val="20"/>
                 <w:szCs w:val="20"/>
               </w:rPr>
-              <w:t xml:space="preserve">4,01 sn</w:t>
-            </w:r>
-          </w:p>
-        </w:tc>
-        <w:tc>
-          <w:tcPr>
-            <w:tcW w:type="dxa" w:w="900"/>
-            <w:tcMar>
-              <w:top w:type="dxa" w:w="60"/>
-              <w:left w:type="dxa" w:w="100"/>
-              <w:bottom w:type="dxa" w:w="60"/>
-              <w:right w:type="dxa" w:w="100"/>
-            </w:tcMar>
-          </w:tcPr>
-          <w:p>
-            <w:pPr>
-              <w:spacing w:after="0" w:line="240"/>
-            </w:pPr>
-            <w:r>
-              <w:rPr>
-                <w:sz w:val="20"/>
-                <w:szCs w:val="20"/>
-              </w:rPr>
-              <w:t xml:space="preserve">11,63 sn</w:t>
+              <w:t xml:space="preserve">4,47 sn</w:t>
             </w:r>
           </w:p>
         </w:tc>
@@ -3430,24 +3560,24 @@
         </w:tc>
         <w:tc>
           <w:tcPr>
-            <w:tcW w:type="dxa" w:w="3560"/>
-            <w:tcMar>
-              <w:top w:type="dxa" w:w="60"/>
-              <w:left w:type="dxa" w:w="100"/>
-              <w:bottom w:type="dxa" w:w="60"/>
-              <w:right w:type="dxa" w:w="100"/>
-            </w:tcMar>
-          </w:tcPr>
-          <w:p>
-            <w:pPr>
-              <w:spacing w:after="0" w:line="240"/>
-            </w:pPr>
-            <w:r>
-              <w:rPr>
-                <w:sz w:val="20"/>
-                <w:szCs w:val="20"/>
-              </w:rPr>
-              <w:t xml:space="preserve">Kalite 11/28. Bozuk Türkçe, veri kaybettiren komut önerisi, halüsinasyon</w:t>
+            <w:tcW w:type="dxa" w:w="2220"/>
+            <w:tcMar>
+              <w:top w:type="dxa" w:w="60"/>
+              <w:left w:type="dxa" w:w="100"/>
+              <w:bottom w:type="dxa" w:w="60"/>
+              <w:right w:type="dxa" w:w="100"/>
+            </w:tcMar>
+          </w:tcPr>
+          <w:p>
+            <w:pPr>
+              <w:spacing w:after="0" w:line="240"/>
+            </w:pPr>
+            <w:r>
+              <w:rPr>
+                <w:sz w:val="20"/>
+                <w:szCs w:val="20"/>
+              </w:rPr>
+              <w:t xml:space="preserve">Elendi</w:t>
             </w:r>
           </w:p>
         </w:tc>
@@ -3455,7 +3585,7 @@
       <w:tr>
         <w:tc>
           <w:tcPr>
-            <w:tcW w:type="dxa" w:w="1900"/>
+            <w:tcW w:type="dxa" w:w="1740"/>
             <w:shd w:fill="F7F7F7" w:color="auto" w:val="clear"/>
             <w:tcMar>
               <w:top w:type="dxa" w:w="60"/>
@@ -3503,6 +3633,54 @@
         </w:tc>
         <w:tc>
           <w:tcPr>
+            <w:tcW w:type="dxa" w:w="1180"/>
+            <w:shd w:fill="F7F7F7" w:color="auto" w:val="clear"/>
+            <w:tcMar>
+              <w:top w:type="dxa" w:w="60"/>
+              <w:left w:type="dxa" w:w="100"/>
+              <w:bottom w:type="dxa" w:w="60"/>
+              <w:right w:type="dxa" w:w="100"/>
+            </w:tcMar>
+          </w:tcPr>
+          <w:p>
+            <w:pPr>
+              <w:spacing w:after="0" w:line="240"/>
+            </w:pPr>
+            <w:r>
+              <w:rPr>
+                <w:sz w:val="20"/>
+                <w:szCs w:val="20"/>
+              </w:rPr>
+              <w:t xml:space="preserve">20/28 *</w:t>
+            </w:r>
+          </w:p>
+        </w:tc>
+        <w:tc>
+          <w:tcPr>
+            <w:tcW w:type="dxa" w:w="1220"/>
+            <w:shd w:fill="F7F7F7" w:color="auto" w:val="clear"/>
+            <w:tcMar>
+              <w:top w:type="dxa" w:w="60"/>
+              <w:left w:type="dxa" w:w="100"/>
+              <w:bottom w:type="dxa" w:w="60"/>
+              <w:right w:type="dxa" w:w="100"/>
+            </w:tcMar>
+          </w:tcPr>
+          <w:p>
+            <w:pPr>
+              <w:spacing w:after="0" w:line="240"/>
+            </w:pPr>
+            <w:r>
+              <w:rPr>
+                <w:sz w:val="20"/>
+                <w:szCs w:val="20"/>
+              </w:rPr>
+              <w:t xml:space="preserve">—</w:t>
+            </w:r>
+          </w:p>
+        </w:tc>
+        <w:tc>
+          <w:tcPr>
             <w:tcW w:type="dxa" w:w="900"/>
             <w:shd w:fill="F7F7F7" w:color="auto" w:val="clear"/>
             <w:tcMar>
@@ -3521,31 +3699,7 @@
                 <w:sz w:val="20"/>
                 <w:szCs w:val="20"/>
               </w:rPr>
-              <w:t xml:space="preserve">7,50 sn</w:t>
-            </w:r>
-          </w:p>
-        </w:tc>
-        <w:tc>
-          <w:tcPr>
-            <w:tcW w:type="dxa" w:w="900"/>
-            <w:shd w:fill="F7F7F7" w:color="auto" w:val="clear"/>
-            <w:tcMar>
-              <w:top w:type="dxa" w:w="60"/>
-              <w:left w:type="dxa" w:w="100"/>
-              <w:bottom w:type="dxa" w:w="60"/>
-              <w:right w:type="dxa" w:w="100"/>
-            </w:tcMar>
-          </w:tcPr>
-          <w:p>
-            <w:pPr>
-              <w:spacing w:after="0" w:line="240"/>
-            </w:pPr>
-            <w:r>
-              <w:rPr>
-                <w:sz w:val="20"/>
-                <w:szCs w:val="20"/>
-              </w:rPr>
-              <w:t xml:space="preserve">9,20 sn</w:t>
+              <w:t xml:space="preserve">8,36 sn</w:t>
             </w:r>
           </w:p>
         </w:tc>
@@ -3575,25 +3729,25 @@
         </w:tc>
         <w:tc>
           <w:tcPr>
-            <w:tcW w:type="dxa" w:w="3560"/>
-            <w:shd w:fill="F7F7F7" w:color="auto" w:val="clear"/>
-            <w:tcMar>
-              <w:top w:type="dxa" w:w="60"/>
-              <w:left w:type="dxa" w:w="100"/>
-              <w:bottom w:type="dxa" w:w="60"/>
-              <w:right w:type="dxa" w:w="100"/>
-            </w:tcMar>
-          </w:tcPr>
-          <w:p>
-            <w:pPr>
-              <w:spacing w:after="0" w:line="240"/>
-            </w:pPr>
-            <w:r>
-              <w:rPr>
-                <w:sz w:val="20"/>
-                <w:szCs w:val="20"/>
-              </w:rPr>
-              <w:t xml:space="preserve">Elendi. Düşünme modu cevabın önüne İngilizce muhakeme yazıyor</w:t>
+            <w:tcW w:type="dxa" w:w="2220"/>
+            <w:shd w:fill="F7F7F7" w:color="auto" w:val="clear"/>
+            <w:tcMar>
+              <w:top w:type="dxa" w:w="60"/>
+              <w:left w:type="dxa" w:w="100"/>
+              <w:bottom w:type="dxa" w:w="60"/>
+              <w:right w:type="dxa" w:w="100"/>
+            </w:tcMar>
+          </w:tcPr>
+          <w:p>
+            <w:pPr>
+              <w:spacing w:after="0" w:line="240"/>
+            </w:pPr>
+            <w:r>
+              <w:rPr>
+                <w:sz w:val="20"/>
+                <w:szCs w:val="20"/>
+              </w:rPr>
+              <w:t xml:space="preserve">Elendi (biçim)</w:t>
             </w:r>
           </w:p>
         </w:tc>
@@ -3613,7 +3767,7 @@
           <w:sz w:val="22"/>
           <w:szCs w:val="22"/>
         </w:rPr>
-        <w:t xml:space="preserve">Kalite sütunu, 14 cevaplanabilir sorunun elle puanlanmasıyla elde edilmiştir (2 = doğru ve yeterli, 1 = kısmen doğru, 0 = yanlış veya alakasız; en yüksek 28).</w:t>
+        <w:t xml:space="preserve">Kalite iki yöntemle ölçülmüştür. Otomatik puan, cevaplanabilir sorulara yazılan beklenen ifadelerin cevapta geçip geçmediğine bakar (hepsi geçerse 2, bir kısmı geçerse 1, hiçbiri geçmezse 0; en yüksek 28). Elle puan aynı ölçeği insan değerlendirmesiyle uygular. İki yöntem aynı sıralamayı vermiştir.</w:t>
       </w:r>
     </w:p>
     <w:p>
@@ -3625,7 +3779,7 @@
           <w:sz w:val="22"/>
           <w:szCs w:val="22"/>
         </w:rPr>
-        <w:t xml:space="preserve">phi-4-mini varsayılan model olarak seçilmiştir. Kalite farkı belirleyicidir: "son commit'i geri al ama değişiklikleri koru" sorusunda doğru komutu (git reset --soft) veren tek küçük modeldir; SQLite, RAG ve VS Code sorularının tamamını doğru yanıtlamıştır. Bedeli gecikmedir: p50 3,95 saniye ile programın 1–3 saniyelik hedefinin dışında kalır ve 8 GB belleğin yaklaşık yarısını kullanır.</w:t>
+        <w:t xml:space="preserve">phi-4-mini varsayılan model olarak seçilmiştir. Kalite farkı belirleyicidir: "son commit'i geri al ama değişiklikleri koru" sorusunda doğru komutu (git reset --soft) veren tek küçük modeldir; SQLite, RAG ve VS Code sorularının tamamını doğru yanıtlamıştır. Bedeli gecikmedir: p50 yaklaşık 4,7 saniye ile programın 1–3 saniyelik hedefinin dışında kalır ve 8 GB belleğin yaklaşık yarısını kullanır.</w:t>
       </w:r>
     </w:p>
     <w:p>
@@ -3661,7 +3815,7 @@
           <w:sz w:val="22"/>
           <w:szCs w:val="22"/>
         </w:rPr>
-        <w:t xml:space="preserve">qwen3-1.7b ölçüme alınmış ancak elenmiştir: model düşünme (thinking) kipinde çalıştığı için Türkçe cevabın önüne İngilizce muhakeme metni yazmakta, çoğu soruda muhakeme belirteç sınırını doldurduğu için cevap hiç görünmemektedir. İstemin sonuna /no_think eklendiğinde Türkçe cevap üretmekte, ancak tek soru 7,1 saniye sürmektedir.</w:t>
+        <w:t xml:space="preserve">(*) qwen3-1.7b otomatik puanlamada qwen2.5-1.5b ile aynı puanı almıştır, ancak cevapları kullanıcıya gösterilebilir durumda değildir: model düşünme kipinde çalıştığı için Türkçe cevabın önüne sayfalarca İngilizce muhakeme yazmakta, çoğu soruda cevabın kendisi belirteç sınırına takılıp hiç görünmemektedir. Doğru komut bu muhakemenin içinde geçtiği için otomatik puan yüksek çıkmaktadır. Bu, ölçütün sınırını gösterir: otomatik puan doğru bilginin bulunduğunu ölçer, cevabın kullanılabilir olduğunu değil. Yöntem, model denemelerini ucuza elemek için uygundur; nihai karar öncesinde cevaplara bir kez gözle bakılmalıdır.</w:t>
       </w:r>
     </w:p>
     <w:p>
@@ -3925,7 +4079,7 @@
                 <w:sz w:val="20"/>
                 <w:szCs w:val="20"/>
               </w:rPr>
-              <w:t xml:space="preserve">Cevaplanamazda çekimserlik</w:t>
+              <w:t xml:space="preserve">Otomatik kalite puanı</w:t>
             </w:r>
           </w:p>
         </w:tc>
@@ -3949,7 +4103,7 @@
                 <w:sz w:val="20"/>
                 <w:szCs w:val="20"/>
               </w:rPr>
-              <w:t xml:space="preserve">5/6 (tamamı erişim eşiği sayesinde)</w:t>
+              <w:t xml:space="preserve">24/28 (%86)</w:t>
             </w:r>
           </w:p>
         </w:tc>
@@ -3974,7 +4128,7 @@
                 <w:sz w:val="20"/>
                 <w:szCs w:val="20"/>
               </w:rPr>
-              <w:t xml:space="preserve">Ortalama yanıt süresi</w:t>
+              <w:t xml:space="preserve">Cevaplanamazda çekimserlik</w:t>
             </w:r>
           </w:p>
         </w:tc>
@@ -3997,7 +4151,7 @@
                 <w:sz w:val="20"/>
                 <w:szCs w:val="20"/>
               </w:rPr>
-              <w:t xml:space="preserve">3,62 sn</w:t>
+              <w:t xml:space="preserve">5/6 (tamamı erişim eşiği sayesinde)</w:t>
             </w:r>
           </w:p>
         </w:tc>
@@ -4023,7 +4177,7 @@
                 <w:sz w:val="20"/>
                 <w:szCs w:val="20"/>
               </w:rPr>
-              <w:t xml:space="preserve">p50 / p95 yanıt süresi</w:t>
+              <w:t xml:space="preserve">Ortalama yanıt süresi</w:t>
             </w:r>
           </w:p>
         </w:tc>
@@ -4047,7 +4201,7 @@
                 <w:sz w:val="20"/>
                 <w:szCs w:val="20"/>
               </w:rPr>
-              <w:t xml:space="preserve">3,95 sn / 10,92 sn</w:t>
+              <w:t xml:space="preserve">4,25 sn</w:t>
             </w:r>
           </w:p>
         </w:tc>
@@ -4072,7 +4226,7 @@
                 <w:sz w:val="20"/>
                 <w:szCs w:val="20"/>
               </w:rPr>
-              <w:t xml:space="preserve">Uç durumlarda çökme</w:t>
+              <w:t xml:space="preserve">p50 / p95 yanıt süresi</w:t>
             </w:r>
           </w:p>
         </w:tc>
@@ -4095,7 +4249,7 @@
                 <w:sz w:val="20"/>
                 <w:szCs w:val="20"/>
               </w:rPr>
-              <w:t xml:space="preserve">0</w:t>
+              <w:t xml:space="preserve">4,72 sn / 12,58 sn</w:t>
             </w:r>
           </w:p>
         </w:tc>
@@ -4121,6 +4275,55 @@
                 <w:sz w:val="20"/>
                 <w:szCs w:val="20"/>
               </w:rPr>
+              <w:t xml:space="preserve">Uç durumlarda çökme</w:t>
+            </w:r>
+          </w:p>
+        </w:tc>
+        <w:tc>
+          <w:tcPr>
+            <w:tcW w:type="dxa" w:w="4680"/>
+            <w:shd w:fill="F7F7F7" w:color="auto" w:val="clear"/>
+            <w:tcMar>
+              <w:top w:type="dxa" w:w="60"/>
+              <w:left w:type="dxa" w:w="100"/>
+              <w:bottom w:type="dxa" w:w="60"/>
+              <w:right w:type="dxa" w:w="100"/>
+            </w:tcMar>
+          </w:tcPr>
+          <w:p>
+            <w:pPr>
+              <w:spacing w:after="0" w:line="240"/>
+            </w:pPr>
+            <w:r>
+              <w:rPr>
+                <w:sz w:val="20"/>
+                <w:szCs w:val="20"/>
+              </w:rPr>
+              <w:t xml:space="preserve">0</w:t>
+            </w:r>
+          </w:p>
+        </w:tc>
+      </w:tr>
+      <w:tr>
+        <w:tc>
+          <w:tcPr>
+            <w:tcW w:type="dxa" w:w="4680"/>
+            <w:tcMar>
+              <w:top w:type="dxa" w:w="60"/>
+              <w:left w:type="dxa" w:w="100"/>
+              <w:bottom w:type="dxa" w:w="60"/>
+              <w:right w:type="dxa" w:w="100"/>
+            </w:tcMar>
+          </w:tcPr>
+          <w:p>
+            <w:pPr>
+              <w:spacing w:after="0" w:line="240"/>
+            </w:pPr>
+            <w:r>
+              <w:rPr>
+                <w:sz w:val="20"/>
+                <w:szCs w:val="20"/>
+              </w:rPr>
               <w:t xml:space="preserve">Birim ve regresyon testleri</w:t>
             </w:r>
           </w:p>
@@ -4128,24 +4331,23 @@
         <w:tc>
           <w:tcPr>
             <w:tcW w:type="dxa" w:w="4680"/>
-            <w:shd w:fill="F7F7F7" w:color="auto" w:val="clear"/>
-            <w:tcMar>
-              <w:top w:type="dxa" w:w="60"/>
-              <w:left w:type="dxa" w:w="100"/>
-              <w:bottom w:type="dxa" w:w="60"/>
-              <w:right w:type="dxa" w:w="100"/>
-            </w:tcMar>
-          </w:tcPr>
-          <w:p>
-            <w:pPr>
-              <w:spacing w:after="0" w:line="240"/>
-            </w:pPr>
-            <w:r>
-              <w:rPr>
-                <w:sz w:val="20"/>
-                <w:szCs w:val="20"/>
-              </w:rPr>
-              <w:t xml:space="preserve">63 test, tamamı geçiyor</w:t>
+            <w:tcMar>
+              <w:top w:type="dxa" w:w="60"/>
+              <w:left w:type="dxa" w:w="100"/>
+              <w:bottom w:type="dxa" w:w="60"/>
+              <w:right w:type="dxa" w:w="100"/>
+            </w:tcMar>
+          </w:tcPr>
+          <w:p>
+            <w:pPr>
+              <w:spacing w:after="0" w:line="240"/>
+            </w:pPr>
+            <w:r>
+              <w:rPr>
+                <w:sz w:val="20"/>
+                <w:szCs w:val="20"/>
+              </w:rPr>
+              <w:t xml:space="preserve">108 test, tamamı geçiyor</w:t>
             </w:r>
           </w:p>
         </w:tc>
@@ -4254,7 +4456,7 @@
           <w:sz w:val="22"/>
           <w:szCs w:val="22"/>
         </w:rPr>
-        <w:t xml:space="preserve">Cevap kalitesi elle puanlanmaktadır; otomatik doğruluk ölçümü yoktur.</w:t>
+        <w:t xml:space="preserve">Otomatik kalite puanı beklenen ifadelerin cevapta geçip geçmediğine bakar; anlamca doğru ama farklı sözcüklerle yazılmış bir cevabı düşük puanlayabilir.</w:t>
       </w:r>
     </w:p>
     <w:p>
@@ -4346,6 +4548,18 @@
           <w:szCs w:val="22"/>
         </w:rPr>
         <w:t xml:space="preserve">Büyük model her zaman iyi model değildir. 2,2 GB'lık phi-3.5-mini, 1,5 GB'lık qwen2.5-1.5b'ye karşı hem daha yavaş hem daha hatalıdır. Sınırlı donanımda seçim ölçütü parametre sayısı değil, hedef dilde talimat takibi ve gecikmedir.</w:t>
+      </w:r>
+    </w:p>
+    <w:p>
+      <w:pPr>
+        <w:spacing w:after="120" w:line="276"/>
+      </w:pPr>
+      <w:r>
+        <w:rPr>
+          <w:sz w:val="22"/>
+          <w:szCs w:val="22"/>
+        </w:rPr>
+        <w:t xml:space="preserve">Sessiz hata, gürültülü hatadan tehlikelidir. Ölçümler bittikten sonra yapılan kod incelemesi üç hata çıkardı: yönlendirmede takvim kelimelerinin mail isteğini bastırması, tanınmayan tarih ifadelerinin sessizce bugüne düşmesi ve web arayüzünün ikon fontunu internetten çekmesi. Üçü de istisna fırlatmıyor, test kırmıyor, yalnızca yanlış davranıyordu. Soru seti de bunları yakalamamıştı çünkü sorular çakışmayacak biçimde seçilmişti; bir test kümesinin ne ölçtüğü kadar neyi ölçmediği de bilinmelidir.</w:t>
       </w:r>
     </w:p>
     <w:p>

</xml_diff>

<commit_message>
docs: yeni arayüz, hibrit erişim ve ölçüm hatalarının belgelenmesi
README yeni çalıştırma biçimine göre yazıldı (uvicorn), arayüz yetenekleri ve
güncel ayarlar (SIM_THRESHOLD 0.34, MAX_TOKENS 450) eklendi; Streamlit
referansları kaldırıldı, requirements.txt güncellendi.

Değerlendirme raporuna üç bölüm eklendi: hibrit erişim ölçümü (yalnız kosinüs
14/12/5, hibrit 14/13/6), iki ölçüm hatası (skorun uygulamadan sapması ve
fazla geniş üretim sınırı) ve nihai durum. Eskiyen bölümlere çapraz referans
konuldu.

Word raporu arayüz bölümüyle yeniden üretildi; sunuma "Arayüz: tanıdık his,
yerel çalışma" slaydı eklendi (15 slayt).

Co-Authored-By: Claude Opus 5 <noreply@anthropic.com>
Claude-Session: https://claude.ai/code/session_01SJvJCPoSUxKzcQB6yPy2t2
</commit_message>
<xml_diff>
--- a/docs/rapor/personas-proje-raporu.docx
+++ b/docs/rapor/personas-proje-raporu.docx
@@ -628,7 +628,7 @@
                 <w:sz w:val="20"/>
                 <w:szCs w:val="20"/>
               </w:rPr>
-              <w:t xml:space="preserve">Arayüz (CLI asgari, Streamlit tercihe bağlı)</w:t>
+              <w:t xml:space="preserve">Arayüz (CLI asgari, Streamlit veya HTML+JS)</w:t>
             </w:r>
           </w:p>
         </w:tc>
@@ -651,7 +651,7 @@
                 <w:sz w:val="20"/>
                 <w:szCs w:val="20"/>
               </w:rPr>
-              <w:t xml:space="preserve">İkisi de: ui/cli.py ve ui/web.py</w:t>
+              <w:t xml:space="preserve">Planın C seçeneği: FastAPI + tek sayfa arayüz (server/), ayrıca ui/cli.py</w:t>
             </w:r>
           </w:p>
         </w:tc>
@@ -701,7 +701,7 @@
                 <w:sz w:val="20"/>
                 <w:szCs w:val="20"/>
               </w:rPr>
-              <w:t xml:space="preserve">eval/questions.json — 30 soru, dört kategori</w:t>
+              <w:t xml:space="preserve">eval/questions.json — 44 soru, beş kategori (yazım hatalı sorular dâhil)</w:t>
             </w:r>
           </w:p>
         </w:tc>
@@ -749,7 +749,7 @@
                 <w:sz w:val="20"/>
                 <w:szCs w:val="20"/>
               </w:rPr>
-              <w:t xml:space="preserve">Kısmen: seçilen modelde p50 ~4,7 sn; hafif alternatif qwen2.5-1.5b ile ~3,0 sn (Bölüm 6.4)</w:t>
+              <w:t xml:space="preserve">Kısmen: p50 4,5 sn, p95 10,3 sn (üretim sınırı ayarlandıktan sonra; öncesinde p95 48 sn idi)</w:t>
             </w:r>
           </w:p>
         </w:tc>
@@ -879,7 +879,7 @@
           <w:sz w:val="22"/>
           <w:szCs w:val="22"/>
         </w:rPr>
-        <w:t xml:space="preserve">Soru embedding'e çevrilir, veritabanındaki 58 parçanın vektörleriyle kosinüs benzerliği hesaplanır, eşiği geçen en iyi üç parça bağlam olarak isteme eklenir. Eşiği geçen parça yoksa dil modeli hiç çağrılmaz; asistan doğrudan bilgisi olmadığını söyler. Bu, hem doğruluk hem hız açısından belirleyicidir: cevaplanamaz sorular ortalama 0,02 saniyede yanıtlanır.</w:t>
+        <w:t xml:space="preserve">Soru embedding'e çevrilir, veritabanındaki 58 parçanın vektörleriyle kosinüs benzerliği hesaplanır ve buna yazım hatalarına dayanıklı sözlüksel bir skor eklenir (0,75 kosinüs + 0,25 sözlüksel); eşiği geçen en iyi üç parça bağlam olarak isteme eklenir. Eşiği geçen parça yoksa dil modeli hiç çağrılmaz; asistan doğrudan bilgisi olmadığını söyler. Bu, hem doğruluk hem hız açısından belirleyicidir: cevaplanamaz sorular ortalama 0,02 saniyede yanıtlanır.</w:t>
       </w:r>
     </w:p>
     <w:p>
@@ -934,6 +934,39 @@
           <w:szCs w:val="22"/>
         </w:rPr>
         <w:t xml:space="preserve">Takvime etkinlik eklemek ve e-posta göndermek yazma işlemleridir ve mimaride ayrı tutulur. assistant.answer() yazma niyeti gördüğünde işlemi yapmaz; taslağı pending_action olarak döndürür. Arayüz taslağı kullanıcıya gösterir ve onay ister; işlemi yalnızca onay sonrası çağrılan assistant.confirm() gerçekleştirir. Silme yeteneği hiç uygulanmamıştır.</w:t>
+      </w:r>
+    </w:p>
+    <w:p>
+      <w:pPr>
+        <w:pStyle w:val="Heading2"/>
+        <w:spacing w:after="120" w:before="240"/>
+      </w:pPr>
+      <w:r>
+        <w:t xml:space="preserve">3.5 Arayüz</w:t>
+      </w:r>
+    </w:p>
+    <w:p>
+      <w:pPr>
+        <w:spacing w:after="120" w:line="276"/>
+      </w:pPr>
+      <w:r>
+        <w:rPr>
+          <w:sz w:val="22"/>
+          <w:szCs w:val="22"/>
+        </w:rPr>
+        <w:t xml:space="preserve">Arayüz, FastAPI üzerinde çalışan tek sayfalık bir web uygulamasıdır (server/). Cevaplar SSE ile token token akıtılır; sohbetler SQLite'ta kalıcıdır; markdown ve kod blokları biçimlendirilir; kaynak rozetine tıklandığında cevabın dayandığı parça metni açılır; belgeler sürükle-bırak ile bilgi tabanına eklenir ve model arayüzden değiştirilebilir.</w:t>
+      </w:r>
+    </w:p>
+    <w:p>
+      <w:pPr>
+        <w:spacing w:after="120" w:line="276"/>
+      </w:pPr>
+      <w:r>
+        <w:rPr>
+          <w:sz w:val="22"/>
+          <w:szCs w:val="22"/>
+        </w:rPr>
+        <w:t xml:space="preserve">Arayüz hiçbir dış kaynağa bağlanmaz: ikon fontu, betik kütüphanesi veya yazı tipi CDN'i yoktur. Bu bilinçli bir kısıttır, çünkü projenin temel iddiası tamamen çevrimdışı çalışmaktır. Program planındaki üç arayüz seçeneğinden C seçeneğine (yerel sunucu + HTML/JS) karşılık gelir.</w:t>
       </w:r>
     </w:p>
     <w:p>
@@ -4030,7 +4063,7 @@
                 <w:sz w:val="20"/>
                 <w:szCs w:val="20"/>
               </w:rPr>
-              <w:t xml:space="preserve">Erişim isabeti hit@1</w:t>
+              <w:t xml:space="preserve">Yazım hatalı sorularda erişim</w:t>
             </w:r>
           </w:p>
         </w:tc>
@@ -4103,7 +4136,7 @@
                 <w:sz w:val="20"/>
                 <w:szCs w:val="20"/>
               </w:rPr>
-              <w:t xml:space="preserve">24/28 (%86)</w:t>
+              <w:t xml:space="preserve">28/28 (%100)</w:t>
             </w:r>
           </w:p>
         </w:tc>
@@ -4151,7 +4184,7 @@
                 <w:sz w:val="20"/>
                 <w:szCs w:val="20"/>
               </w:rPr>
-              <w:t xml:space="preserve">5/6 (tamamı erişim eşiği sayesinde)</w:t>
+              <w:t xml:space="preserve">6/6 (%100)</w:t>
             </w:r>
           </w:p>
         </w:tc>
@@ -4201,7 +4234,7 @@
                 <w:sz w:val="20"/>
                 <w:szCs w:val="20"/>
               </w:rPr>
-              <w:t xml:space="preserve">4,25 sn</w:t>
+              <w:t xml:space="preserve">4,60 sn</w:t>
             </w:r>
           </w:p>
         </w:tc>
@@ -4249,7 +4282,7 @@
                 <w:sz w:val="20"/>
                 <w:szCs w:val="20"/>
               </w:rPr>
-              <w:t xml:space="preserve">4,72 sn / 12,58 sn</w:t>
+              <w:t xml:space="preserve">4,50 sn / 10,27 sn</w:t>
             </w:r>
           </w:p>
         </w:tc>
@@ -4324,7 +4357,7 @@
                 <w:sz w:val="20"/>
                 <w:szCs w:val="20"/>
               </w:rPr>
-              <w:t xml:space="preserve">Birim ve regresyon testleri</w:t>
+              <w:t xml:space="preserve">Birim, HTTP ve regresyon testleri</w:t>
             </w:r>
           </w:p>
         </w:tc>
@@ -4347,7 +4380,7 @@
                 <w:sz w:val="20"/>
                 <w:szCs w:val="20"/>
               </w:rPr>
-              <w:t xml:space="preserve">108 test, tamamı geçiyor</w:t>
+              <w:t xml:space="preserve">167 test, tamamı geçiyor</w:t>
             </w:r>
           </w:p>
         </w:tc>

</xml_diff>

<commit_message>
feat: CLI'da satır içi atıf haritası
Web arayüzünde her cümlenin sonunda rozet var; terminalde cevap akarak
yazıldığı için rozet metnin içine konamıyor. Bunun yerine cevabın altına
cümle sırasına göre bir harita yazılıyor:

  Kaynaklar: [1] python-notlari.md · [2] vscode-notlari.md
  Atıflar: 1→[1] 3→[1] 4→[1] · atıfsız: 2

Numaralar iki arayüzde aynı, ikisi de getirilen parçaların sırasını kullanıyor.
Atıfsız cümleler ayrıca yazılıyor: yanlış atıf, atıfsızlıktan kötüdür — hangi
cümlenin belgeye bağlanamadığı görünür olmalı.

Parçası olmayan cevaplarda (takvim, mail) eski tek satırlık kaynak çıktısı
korundu. README ve Word raporu (7.3) buna göre güncellendi. 275 test geçiyor.

Co-Authored-By: Claude Opus 5 <noreply@anthropic.com>
Claude-Session: https://claude.ai/code/session_01LcHtTyJo9ePd7sr1iptCrX
</commit_message>
<xml_diff>
--- a/docs/rapor/personas-proje-raporu.docx
+++ b/docs/rapor/personas-proje-raporu.docx
@@ -4528,7 +4528,7 @@
                 <w:sz w:val="20"/>
                 <w:szCs w:val="20"/>
               </w:rPr>
-              <w:t xml:space="preserve">270 test, tamamı geçiyor</w:t>
+              <w:t xml:space="preserve">275 test, tamamı geçiyor</w:t>
             </w:r>
           </w:p>
         </w:tc>
@@ -4906,6 +4906,18 @@
           <w:szCs w:val="22"/>
         </w:rPr>
         <w:t xml:space="preserve">İkinci yol, atıfı cevap üretildikten sonra çıkarmaktır: app/citations.py her cümleyi, sadakat ölçümünün kullandığı sözlüksel eşleştirmeyle en çok örtüşen parçaya bağlar. Bu yol seçilmiştir. Ölçülen maliyet cevap başına 2,7 milisaniyedir; istem, cevaplar ve Bölüm 6'daki metriklerin hiçbiri değişmemiştir. Atıflar veritabanına yazılmaz, metin ve parçalar zaten saklandığı için geçmiş sohbet açıldığında yeniden hesaplanır.</w:t>
+      </w:r>
+    </w:p>
+    <w:p>
+      <w:pPr>
+        <w:spacing w:after="120" w:line="276"/>
+      </w:pPr>
+      <w:r>
+        <w:rPr>
+          <w:sz w:val="22"/>
+          <w:szCs w:val="22"/>
+        </w:rPr>
+        <w:t xml:space="preserve">Terminal arayüzünde cevap akarak yazıldığı için rozet metnin içine konamaz; atıflar cevabın altına cümle sırasına göre bir harita olarak yazılır ("Atıflar: 1→[1] 3→[1] · atıfsız: 2"). Numaralar iki arayüzde aynıdır, çünkü ikisi de getirilen parçaların sırasını kullanır.</w:t>
       </w:r>
     </w:p>
     <w:p>

</xml_diff>